<commit_message>
feat(content): EN docx for 43 poems + repair RU poem source/media (stray bold, missing image anchors)
</commit_message>
<xml_diff>
--- a/src/content/poetry/18-my-poteryalis-v-etom-mire/ru.docx
+++ b/src/content/poetry/18-my-poteryalis-v-etom-mire/ru.docx
@@ -7,10 +7,6 @@
         <w:pStyle w:val="ad"/>
       </w:pPr>
       <w:r>
-        <w:rPr>
-          <w:rStyle w:val="ae"/>
-          <w:rFonts w:eastAsiaTheme="majorEastAsia"/>
-        </w:rPr>
         <w:t>Мы потерялись в этом мире,</w:t>
       </w:r>
       <w:r>

</xml_diff>